<commit_message>
chore(resume): bo sung skills tung lam, gon lai Tools, regen DOC/PDF
- Earlier (2012-2018): them Ruby on Rails, Python, Perl, C/C++,
  Objective-C, Swift, Xcode, Android Studio, React, Vue, jQuery,
  D3.js, PostgreSQL; tach MySQL / MongoDB thanh 2 the rieng
- Bo dong "Background from full-stack & mobile years - not actively
  used today." va CSS .skills-subtext / .skills-tags-wrapper khong
  con dung (ca block screen lan print)
- Tools: them Bash, tach "Ubuntu / macOS" thanh "Linux (Ubuntu)" +
  "macOS"
- Angular ecosystem: them Angular Material
- Regen assets/quang-tang-cv.docx theo noi dung moi
- Them assets/quang-tang-cv.pdf (render tu resume.html bang headless
  Chrome --print-to-pdf, 2 trang A4); chua co nut nao tren trang tro
  toi file nay

Co-Authored-By: Claude Opus 5 <noreply@anthropic.com>
</commit_message>
<xml_diff>
--- a/assets/quang-tang-cv.docx
+++ b/assets/quang-tang-cv.docx
@@ -673,7 +673,7 @@
           <w:sz w:val="18"/>
           <w:szCs w:val="18"/>
         </w:rPr>
-        <w:t xml:space="preserve">Angular v2 → latest   ·   AngularJS (v1)   ·   RxJS   ·   Signals   ·   Standalone &amp; Control Flow</w:t>
+        <w:t xml:space="preserve">Angular v2 → latest   ·   AngularJS (v1)   ·   RxJS   ·   Signals   ·   Angular Material   ·   Standalone &amp; Control Flow</w:t>
       </w:r>
     </w:p>
     <w:p>
@@ -763,7 +763,7 @@
           <w:sz w:val="18"/>
           <w:szCs w:val="18"/>
         </w:rPr>
-        <w:t xml:space="preserve">Git   ·   Docker   ·   Nginx   ·   Ubuntu / macOS</w:t>
+        <w:t xml:space="preserve">Git   ·   Docker   ·   Nginx   ·   Bash   ·   Linux (Ubuntu)   ·   macOS</w:t>
       </w:r>
     </w:p>
     <w:p>
@@ -784,7 +784,7 @@
     </w:p>
     <w:p>
       <w:pPr>
-        <w:spacing w:after="20"/>
+        <w:spacing w:after="140"/>
       </w:pPr>
       <w:r>
         <w:rPr>
@@ -793,23 +793,7 @@
           <w:sz w:val="18"/>
           <w:szCs w:val="18"/>
         </w:rPr>
-        <w:t xml:space="preserve">Node.js   ·   MySQL / MongoDB   ·   Android / iOS   ·   Cordova</w:t>
-      </w:r>
-    </w:p>
-    <w:p>
-      <w:pPr>
-        <w:spacing w:after="140"/>
-      </w:pPr>
-      <w:r>
-        <w:rPr>
-          <w:rFonts w:ascii="Calibri" w:cs="Calibri" w:eastAsia="Calibri" w:hAnsi="Calibri"/>
-          <w:i/>
-          <w:iCs/>
-          <w:color w:val="64748B"/>
-          <w:sz w:val="14"/>
-          <w:szCs w:val="14"/>
-        </w:rPr>
-        <w:t xml:space="preserve">Background from full-stack &amp; mobile years – not actively used today.</w:t>
+        <w:t xml:space="preserve">Node.js   ·   Ruby on Rails   ·   Python   ·   Perl   ·   C / C++   ·   Objective-C   ·   Swift   ·   Android / iOS   ·   Cordova   ·   Xcode   ·   Android Studio   ·   React   ·   Vue   ·   jQuery   ·   D3.js   ·   PostgreSQL   ·   MySQL   ·   MongoDB</w:t>
       </w:r>
     </w:p>
     <w:p>

</xml_diff>

<commit_message>
feat(resume): gop skills vao mot hang Languages, them AI tools va nut Download PDF
- Bocasay: them bullet ve Chrome extension viet bang React
- Gop 3 hang Angular ecosystem / Other frontend / Earlier vao hang
  Languages duy nhat: 11 the dang dung (teal) + 17 the tung dung
  (muted). React chuyen tu muted sang dang dung vi lam o Bocasay
- Them hang AI tools: Claude Code, Google Antigravity, Codex,
  ChatGPT, Gemini
- Karma / Jasmine cho noi teal ngang Cypress E2E
- Them nut "Download PDF" (icon tai lieu, khac icon mui ten cua nut
  DOC de phan biet duoc khi an chu o man hinh < 880px)
- Doi nhan nut in "Print CV / Export PDF" -> "Print CV", tranh hai
  nut cung hua PDF
- Regen assets/quang-tang-cv.docx va assets/quang-tang-cv.pdf

Co-Authored-By: Claude Opus 5 <noreply@anthropic.com>
</commit_message>
<xml_diff>
--- a/assets/quang-tang-cv.docx
+++ b/assets/quang-tang-cv.docx
@@ -312,6 +312,25 @@
           <w:sz w:val="19"/>
           <w:szCs w:val="19"/>
         </w:rPr>
+        <w:t xml:space="preserve">Built a companion Chrome extension in React to deliver features that require browser-level access, unlocking capabilities in the main web app that a standard page cannot provide on its own.</w:t>
+      </w:r>
+    </w:p>
+    <w:p>
+      <w:pPr>
+        <w:pStyle w:val="ListParagraph"/>
+        <w:numPr>
+          <w:ilvl w:val="0"/>
+          <w:numId w:val="1"/>
+        </w:numPr>
+        <w:spacing w:after="90"/>
+      </w:pPr>
+      <w:r>
+        <w:rPr>
+          <w:rFonts w:ascii="Calibri" w:cs="Calibri" w:eastAsia="Calibri" w:hAnsi="Calibri"/>
+          <w:color w:val="1E293B"/>
+          <w:sz w:val="19"/>
+          <w:szCs w:val="19"/>
+        </w:rPr>
         <w:t xml:space="preserve">Established coding guidelines, enforced architectural consistency, and managed structured code reviews to ensure clean, high-performance, and maintainable software.</w:t>
       </w:r>
     </w:p>
@@ -643,7 +662,7 @@
           <w:sz w:val="18"/>
           <w:szCs w:val="18"/>
         </w:rPr>
-        <w:t xml:space="preserve">TypeScript   ·   JavaScript (ES6+)   ·   HTML5   ·   SCSS / CSS3</w:t>
+        <w:t xml:space="preserve">TypeScript   ·   JavaScript (ES6+)   ·   HTML5   ·   SCSS / CSS3   ·   Angular v2 → latest   ·   AngularJS (v1)   ·   RxJS   ·   Signals   ·   Angular Material   ·   Standalone &amp; Control Flow   ·   React   ·   Node.js   ·   Ruby on Rails   ·   Python   ·   Perl   ·   C / C++   ·   Objective-C   ·   Swift   ·   Android / iOS   ·   Cordova   ·   Xcode   ·   Android Studio   ·   Vue   ·   jQuery   ·   D3.js   ·   PostgreSQL   ·   MySQL   ·   MongoDB</w:t>
       </w:r>
     </w:p>
     <w:p>
@@ -659,7 +678,7 @@
           <w:sz w:val="15"/>
           <w:szCs w:val="15"/>
         </w:rPr>
-        <w:t xml:space="preserve">ANGULAR ECOSYSTEM</w:t>
+        <w:t xml:space="preserve">TESTING</w:t>
       </w:r>
     </w:p>
     <w:p>
@@ -673,7 +692,7 @@
           <w:sz w:val="18"/>
           <w:szCs w:val="18"/>
         </w:rPr>
-        <w:t xml:space="preserve">Angular v2 → latest   ·   AngularJS (v1)   ·   RxJS   ·   Signals   ·   Angular Material   ·   Standalone &amp; Control Flow</w:t>
+        <w:t xml:space="preserve">Cypress E2E   ·   Karma / Jasmine   ·   Integration testing</w:t>
       </w:r>
     </w:p>
     <w:p>
@@ -689,7 +708,7 @@
           <w:sz w:val="15"/>
           <w:szCs w:val="15"/>
         </w:rPr>
-        <w:t xml:space="preserve">TESTING</w:t>
+        <w:t xml:space="preserve">PRACTICES</w:t>
       </w:r>
     </w:p>
     <w:p>
@@ -703,7 +722,7 @@
           <w:sz w:val="18"/>
           <w:szCs w:val="18"/>
         </w:rPr>
-        <w:t xml:space="preserve">Cypress E2E   ·   Karma / Jasmine   ·   Integration testing</w:t>
+        <w:t xml:space="preserve">Component architecture   ·   REST integration   ·   Code review &amp; mentoring</w:t>
       </w:r>
     </w:p>
     <w:p>
@@ -719,7 +738,7 @@
           <w:sz w:val="15"/>
           <w:szCs w:val="15"/>
         </w:rPr>
-        <w:t xml:space="preserve">PRACTICES</w:t>
+        <w:t xml:space="preserve">TOOLS</w:t>
       </w:r>
     </w:p>
     <w:p>
@@ -733,7 +752,7 @@
           <w:sz w:val="18"/>
           <w:szCs w:val="18"/>
         </w:rPr>
-        <w:t xml:space="preserve">Component architecture   ·   REST integration   ·   Code review &amp; mentoring</w:t>
+        <w:t xml:space="preserve">Git   ·   Docker   ·   Nginx   ·   Bash   ·   Linux (Ubuntu)   ·   macOS</w:t>
       </w:r>
     </w:p>
     <w:p>
@@ -749,7 +768,7 @@
           <w:sz w:val="15"/>
           <w:szCs w:val="15"/>
         </w:rPr>
-        <w:t xml:space="preserve">TOOLS</w:t>
+        <w:t xml:space="preserve">AI TOOLS</w:t>
       </w:r>
     </w:p>
     <w:p>
@@ -763,37 +782,7 @@
           <w:sz w:val="18"/>
           <w:szCs w:val="18"/>
         </w:rPr>
-        <w:t xml:space="preserve">Git   ·   Docker   ·   Nginx   ·   Bash   ·   Linux (Ubuntu)   ·   macOS</w:t>
-      </w:r>
-    </w:p>
-    <w:p>
-      <w:pPr>
-        <w:spacing w:after="40"/>
-      </w:pPr>
-      <w:r>
-        <w:rPr>
-          <w:rFonts w:ascii="Calibri" w:cs="Calibri" w:eastAsia="Calibri" w:hAnsi="Calibri"/>
-          <w:b/>
-          <w:bCs/>
-          <w:color w:val="64748B"/>
-          <w:sz w:val="15"/>
-          <w:szCs w:val="15"/>
-        </w:rPr>
-        <w:t xml:space="preserve">EARLIER (2012–2018)</w:t>
-      </w:r>
-    </w:p>
-    <w:p>
-      <w:pPr>
-        <w:spacing w:after="140"/>
-      </w:pPr>
-      <w:r>
-        <w:rPr>
-          <w:rFonts w:ascii="Calibri" w:cs="Calibri" w:eastAsia="Calibri" w:hAnsi="Calibri"/>
-          <w:color w:val="1E293B"/>
-          <w:sz w:val="18"/>
-          <w:szCs w:val="18"/>
-        </w:rPr>
-        <w:t xml:space="preserve">Node.js   ·   Ruby on Rails   ·   Python   ·   Perl   ·   C / C++   ·   Objective-C   ·   Swift   ·   Android / iOS   ·   Cordova   ·   Xcode   ·   Android Studio   ·   React   ·   Vue   ·   jQuery   ·   D3.js   ·   PostgreSQL   ·   MySQL   ·   MongoDB</w:t>
+        <w:t xml:space="preserve">Claude Code   ·   Google Antigravity   ·   Codex   ·   ChatGPT   ·   Gemini</w:t>
       </w:r>
     </w:p>
     <w:p>

</xml_diff>